<commit_message>
Put the designer's name on the sell sheet
The contact block has been four placeholders since it was written, which is a
strange thing to hand a publisher. Filled in, and in the generator rather than
the document, so every future regeneration carries them.

Co-Authored-By: Claude Opus 5 <noreply@anthropic.com>
Claude-Session: https://claude.ai/code/session_01PrAjux8gaxheGCQfmmpAzy
</commit_message>
<xml_diff>
--- a/Entrepreneurs_SellSheet_v21.docx
+++ b/Entrepreneurs_SellSheet_v21.docx
@@ -1599,7 +1599,7 @@
                 <w:sz w:val="18"/>
                 <w:szCs w:val="18"/>
               </w:rPr>
-              <w:t xml:space="preserve">Designer:  [Your name]</w:t>
+              <w:t xml:space="preserve">Designer:  Didson New</w:t>
             </w:r>
           </w:p>
           <w:p>
@@ -1613,7 +1613,7 @@
                 <w:sz w:val="18"/>
                 <w:szCs w:val="18"/>
               </w:rPr>
-              <w:t xml:space="preserve">Email:  [your@email]</w:t>
+              <w:t xml:space="preserve">Email:  didson.onew@gmail.com</w:t>
             </w:r>
           </w:p>
           <w:p>
@@ -1627,21 +1627,21 @@
                 <w:sz w:val="18"/>
                 <w:szCs w:val="18"/>
               </w:rPr>
-              <w:t xml:space="preserve">Location:  [City, Country]</w:t>
-            </w:r>
-          </w:p>
-          <w:p>
-            <w:pPr>
-              <w:spacing w:after="0" w:line="252"/>
-            </w:pPr>
-            <w:r>
-              <w:rPr>
-                <w:rFonts w:ascii="Calibri" w:cs="Calibri" w:eastAsia="Calibri" w:hAnsi="Calibri"/>
-                <w:color w:val="1A1A1A"/>
-                <w:sz w:val="18"/>
-                <w:szCs w:val="18"/>
-              </w:rPr>
-              <w:t xml:space="preserve">Play it:  [link]</w:t>
+              <w:t xml:space="preserve">Location:  São Paulo, Brazil</w:t>
+            </w:r>
+          </w:p>
+          <w:p>
+            <w:pPr>
+              <w:spacing w:after="0" w:line="252"/>
+            </w:pPr>
+            <w:r>
+              <w:rPr>
+                <w:rFonts w:ascii="Calibri" w:cs="Calibri" w:eastAsia="Calibri" w:hAnsi="Calibri"/>
+                <w:color w:val="1A1A1A"/>
+                <w:sz w:val="18"/>
+                <w:szCs w:val="18"/>
+              </w:rPr>
+              <w:t xml:space="preserve">Play it:  entrepreneurs.itch.io</w:t>
             </w:r>
           </w:p>
         </w:tc>

</xml_diff>